<commit_message>
Remittance and Claims UX Design v1.1 with screenshots, packs v1.1 and Conformance Register v1.7
Screens of the running application captured on seed data for the delivered
Remittance and Claims screens and the insurer co-insurance tab. UX Design,
Reports Notifications and Outputs, Developer Specification and Data
Dictionary v1.1 issued in the Remittance and Claims packs; Product
Maintenance UX Design v1.8. The Remittance and Claims FRS items are assessed
and counted in Conformance Register v1.7, with walkthrough checks of the
new claims tabs and the worklist export. Decision Log O-023.
</commit_message>
<xml_diff>
--- a/docs/deliverables/out/Programme/BDOI_Template_FRS/BRD-02_Operations_Remittance/BIBS_Inputs_BRD-02_Remittance_How_to_Read_this_Pack_v1.0.docx
+++ b/docs/deliverables/out/Programme/BDOI_Template_FRS/BRD-02_Operations_Remittance/BIBS_Inputs_BRD-02_Remittance_How_to_Read_this_Pack_v1.0.docx
@@ -1947,7 +1947,7 @@
                 <w:i w:val="0"/>
                 <w:sz w:val="18"/>
               </w:rPr>
-              <w:t>1.0</w:t>
+              <w:t>1.1</w:t>
             </w:r>
           </w:p>
         </w:tc>
@@ -2047,7 +2047,7 @@
                 <w:i w:val="0"/>
                 <w:sz w:val="18"/>
               </w:rPr>
-              <w:t>1.0</w:t>
+              <w:t>1.1</w:t>
             </w:r>
           </w:p>
         </w:tc>
@@ -2247,7 +2247,7 @@
                 <w:i w:val="0"/>
                 <w:sz w:val="18"/>
               </w:rPr>
-              <w:t>1.0</w:t>
+              <w:t>1.1</w:t>
             </w:r>
           </w:p>
         </w:tc>
@@ -2347,7 +2347,7 @@
                 <w:i w:val="0"/>
                 <w:sz w:val="18"/>
               </w:rPr>
-              <w:t>1.0</w:t>
+              <w:t>1.1</w:t>
             </w:r>
           </w:p>
         </w:tc>

</xml_diff>